<commit_message>
Bao cao: them muc 2.4 - du lieu phuc vu app WiseTravel chinh thuc
Noi ro dau ra do an (kho pois + module cam xuc ViSoBERT) la tang du lieu
backend cho app chinh thuc doc/hien thi. Dong bo docx + md.

Co-Authored-By: Claude Opus 4.8 <noreply@anthropic.com>
</commit_message>
<xml_diff>
--- a/BAO_CAO_DEMO.docx
+++ b/BAO_CAO_DEMO.docx
@@ -83,14 +83,12 @@
       <w:pPr>
         <w:pStyle w:val="Heading1"/>
         <w:rPr>
-          <w:rFonts w:ascii="Times New Roman" w:hAnsi="Times New Roman" w:cs="Times New Roman"/>
-          <w:color w:val="auto"/>
+          <w:rFonts w:cs="Times New Roman"/>
         </w:rPr>
       </w:pPr>
       <w:r>
         <w:rPr>
-          <w:rFonts w:ascii="Times New Roman" w:hAnsi="Times New Roman" w:cs="Times New Roman"/>
-          <w:color w:val="auto"/>
+          <w:rFonts w:cs="Times New Roman"/>
         </w:rPr>
         <w:t>Tóm tắt kết quả</w:t>
       </w:r>
@@ -379,14 +377,12 @@
       <w:pPr>
         <w:pStyle w:val="Heading1"/>
         <w:rPr>
-          <w:rFonts w:ascii="Times New Roman" w:hAnsi="Times New Roman" w:cs="Times New Roman"/>
-          <w:color w:val="auto"/>
+          <w:rFonts w:cs="Times New Roman"/>
         </w:rPr>
       </w:pPr>
       <w:r>
         <w:rPr>
-          <w:rFonts w:ascii="Times New Roman" w:hAnsi="Times New Roman" w:cs="Times New Roman"/>
-          <w:color w:val="auto"/>
+          <w:rFonts w:cs="Times New Roman"/>
         </w:rPr>
         <w:t>1. Bài toán &amp; mục tiêu</w:t>
       </w:r>
@@ -427,9 +423,6 @@
     </w:p>
     <w:p>
       <w:r>
-        <w:rPr>
-          <w:i w:val="0"/>
-        </w:rPr>
         <w:t>Dữ liệu được tổ chức thành hai kho tách biệt theo hai bài toán, cộng các file kiểm chứng. Địa điểm lưu trong SQLite (một bảng pois, mỗi dòng một địa điểm, khóa chính là mã OSM); dữ liệu cảm xúc lưu dạng CSV phẳng để hai người dễ cùng gán nhãn.</w:t>
       </w:r>
     </w:p>
@@ -443,81 +436,89 @@
     </w:p>
     <w:p>
       <w:r>
-        <w:rPr>
-          <w:i w:val="0"/>
-        </w:rPr>
         <w:t>Mỗi dòng là một địa điểm. Cột hours_source đánh dấu rõ nguồn của giờ mở cửa để tách dữ liệu thật khỏi giá trị heuristic khi đo chất lượng.</w:t>
       </w:r>
     </w:p>
     <w:tbl>
       <w:tblPr>
         <w:tblStyle w:val="LightGrid-Accent1"/>
-        <w:tblW w:type="auto" w:w="0"/>
+        <w:tblW w:w="0" w:type="auto"/>
         <w:jc w:val="center"/>
-        <w:tblLook w:firstColumn="1" w:firstRow="1" w:lastColumn="0" w:lastRow="0" w:noHBand="0" w:noVBand="1" w:val="04A0"/>
+        <w:tblLook w:val="04A0" w:firstRow="1" w:lastRow="0" w:firstColumn="1" w:lastColumn="0" w:noHBand="0" w:noVBand="1"/>
       </w:tblPr>
       <w:tblGrid>
-        <w:gridCol w:w="2880"/>
-        <w:gridCol w:w="2880"/>
-        <w:gridCol w:w="2880"/>
+        <w:gridCol w:w="2613"/>
+        <w:gridCol w:w="1889"/>
+        <w:gridCol w:w="4354"/>
       </w:tblGrid>
       <w:tr>
+        <w:trPr>
+          <w:cnfStyle w:val="100000000000" w:firstRow="1" w:lastRow="0" w:firstColumn="0" w:lastColumn="0" w:oddVBand="0" w:evenVBand="0" w:oddHBand="0" w:evenHBand="0" w:firstRowFirstColumn="0" w:firstRowLastColumn="0" w:lastRowFirstColumn="0" w:lastRowLastColumn="0"/>
+          <w:jc w:val="center"/>
+        </w:trPr>
         <w:tc>
           <w:tcPr>
-            <w:tcW w:type="dxa" w:w="2268"/>
+            <w:cnfStyle w:val="001000000000" w:firstRow="0" w:lastRow="0" w:firstColumn="1" w:lastColumn="0" w:oddVBand="0" w:evenVBand="0" w:oddHBand="0" w:evenHBand="0" w:firstRowFirstColumn="0" w:firstRowLastColumn="0" w:lastRowFirstColumn="0" w:lastRowLastColumn="0"/>
+            <w:tcW w:w="2268" w:type="dxa"/>
           </w:tcPr>
           <w:p>
             <w:r>
-              <w:rPr>
-                <w:b/>
-              </w:rPr>
               <w:t>Trường</w:t>
             </w:r>
           </w:p>
         </w:tc>
         <w:tc>
           <w:tcPr>
-            <w:tcW w:type="dxa" w:w="1984"/>
+            <w:tcW w:w="1984" w:type="dxa"/>
           </w:tcPr>
           <w:p>
+            <w:pPr>
+              <w:cnfStyle w:val="100000000000" w:firstRow="1" w:lastRow="0" w:firstColumn="0" w:lastColumn="0" w:oddVBand="0" w:evenVBand="0" w:oddHBand="0" w:evenHBand="0" w:firstRowFirstColumn="0" w:firstRowLastColumn="0" w:lastRowFirstColumn="0" w:lastRowLastColumn="0"/>
+            </w:pPr>
             <w:r>
-              <w:rPr>
-                <w:b/>
-              </w:rPr>
               <w:t>Kiểu</w:t>
             </w:r>
           </w:p>
         </w:tc>
         <w:tc>
           <w:tcPr>
-            <w:tcW w:type="dxa" w:w="4535"/>
+            <w:tcW w:w="4535" w:type="dxa"/>
           </w:tcPr>
           <w:p>
+            <w:pPr>
+              <w:cnfStyle w:val="100000000000" w:firstRow="1" w:lastRow="0" w:firstColumn="0" w:lastColumn="0" w:oddVBand="0" w:evenVBand="0" w:oddHBand="0" w:evenHBand="0" w:firstRowFirstColumn="0" w:firstRowLastColumn="0" w:lastRowFirstColumn="0" w:lastRowLastColumn="0"/>
+            </w:pPr>
             <w:r>
-              <w:rPr>
-                <w:b/>
-              </w:rPr>
               <w:t>Ý nghĩa</w:t>
             </w:r>
           </w:p>
         </w:tc>
       </w:tr>
       <w:tr>
+        <w:trPr>
+          <w:cnfStyle w:val="000000100000" w:firstRow="0" w:lastRow="0" w:firstColumn="0" w:lastColumn="0" w:oddVBand="0" w:evenVBand="0" w:oddHBand="1" w:evenHBand="0" w:firstRowFirstColumn="0" w:firstRowLastColumn="0" w:lastRowFirstColumn="0" w:lastRowLastColumn="0"/>
+          <w:jc w:val="center"/>
+        </w:trPr>
         <w:tc>
           <w:tcPr>
-            <w:tcW w:type="dxa" w:w="2268"/>
+            <w:cnfStyle w:val="001000000000" w:firstRow="0" w:lastRow="0" w:firstColumn="1" w:lastColumn="0" w:oddVBand="0" w:evenVBand="0" w:oddHBand="0" w:evenHBand="0" w:firstRowFirstColumn="0" w:firstRowLastColumn="0" w:lastRowFirstColumn="0" w:lastRowLastColumn="0"/>
+            <w:tcW w:w="2268" w:type="dxa"/>
           </w:tcPr>
           <w:p>
             <w:r>
+              <w:lastRenderedPageBreak/>
               <w:t>id</w:t>
             </w:r>
           </w:p>
         </w:tc>
         <w:tc>
           <w:tcPr>
-            <w:tcW w:type="dxa" w:w="1984"/>
+            <w:tcW w:w="1984" w:type="dxa"/>
           </w:tcPr>
           <w:p>
+            <w:pPr>
+              <w:cnfStyle w:val="000000100000" w:firstRow="0" w:lastRow="0" w:firstColumn="0" w:lastColumn="0" w:oddVBand="0" w:evenVBand="0" w:oddHBand="1" w:evenHBand="0" w:firstRowFirstColumn="0" w:firstRowLastColumn="0" w:lastRowFirstColumn="0" w:lastRowLastColumn="0"/>
+            </w:pPr>
             <w:r>
               <w:t>TEXT (khóa chính)</w:t>
             </w:r>
@@ -525,9 +526,12 @@
         </w:tc>
         <w:tc>
           <w:tcPr>
-            <w:tcW w:type="dxa" w:w="4535"/>
+            <w:tcW w:w="4535" w:type="dxa"/>
           </w:tcPr>
           <w:p>
+            <w:pPr>
+              <w:cnfStyle w:val="000000100000" w:firstRow="0" w:lastRow="0" w:firstColumn="0" w:lastColumn="0" w:oddVBand="0" w:evenVBand="0" w:oddHBand="1" w:evenHBand="0" w:firstRowFirstColumn="0" w:firstRowLastColumn="0" w:lastRowFirstColumn="0" w:lastRowLastColumn="0"/>
+            </w:pPr>
             <w:r>
               <w:t>Mã địa điểm từ OSM, vd node/123, way/456</w:t>
             </w:r>
@@ -535,9 +539,14 @@
         </w:tc>
       </w:tr>
       <w:tr>
+        <w:trPr>
+          <w:cnfStyle w:val="000000010000" w:firstRow="0" w:lastRow="0" w:firstColumn="0" w:lastColumn="0" w:oddVBand="0" w:evenVBand="0" w:oddHBand="0" w:evenHBand="1" w:firstRowFirstColumn="0" w:firstRowLastColumn="0" w:lastRowFirstColumn="0" w:lastRowLastColumn="0"/>
+          <w:jc w:val="center"/>
+        </w:trPr>
         <w:tc>
           <w:tcPr>
-            <w:tcW w:type="dxa" w:w="2268"/>
+            <w:cnfStyle w:val="001000000000" w:firstRow="0" w:lastRow="0" w:firstColumn="1" w:lastColumn="0" w:oddVBand="0" w:evenVBand="0" w:oddHBand="0" w:evenHBand="0" w:firstRowFirstColumn="0" w:firstRowLastColumn="0" w:lastRowFirstColumn="0" w:lastRowLastColumn="0"/>
+            <w:tcW w:w="2268" w:type="dxa"/>
           </w:tcPr>
           <w:p>
             <w:r>
@@ -547,9 +556,12 @@
         </w:tc>
         <w:tc>
           <w:tcPr>
-            <w:tcW w:type="dxa" w:w="1984"/>
+            <w:tcW w:w="1984" w:type="dxa"/>
           </w:tcPr>
           <w:p>
+            <w:pPr>
+              <w:cnfStyle w:val="000000010000" w:firstRow="0" w:lastRow="0" w:firstColumn="0" w:lastColumn="0" w:oddVBand="0" w:evenVBand="0" w:oddHBand="0" w:evenHBand="1" w:firstRowFirstColumn="0" w:firstRowLastColumn="0" w:lastRowFirstColumn="0" w:lastRowLastColumn="0"/>
+            </w:pPr>
             <w:r>
               <w:t>TEXT</w:t>
             </w:r>
@@ -557,9 +569,12 @@
         </w:tc>
         <w:tc>
           <w:tcPr>
-            <w:tcW w:type="dxa" w:w="4535"/>
+            <w:tcW w:w="4535" w:type="dxa"/>
           </w:tcPr>
           <w:p>
+            <w:pPr>
+              <w:cnfStyle w:val="000000010000" w:firstRow="0" w:lastRow="0" w:firstColumn="0" w:lastColumn="0" w:oddVBand="0" w:evenVBand="0" w:oddHBand="0" w:evenHBand="1" w:firstRowFirstColumn="0" w:firstRowLastColumn="0" w:lastRowFirstColumn="0" w:lastRowLastColumn="0"/>
+            </w:pPr>
             <w:r>
               <w:t>Tên địa điểm</w:t>
             </w:r>
@@ -567,9 +582,14 @@
         </w:tc>
       </w:tr>
       <w:tr>
+        <w:trPr>
+          <w:cnfStyle w:val="000000100000" w:firstRow="0" w:lastRow="0" w:firstColumn="0" w:lastColumn="0" w:oddVBand="0" w:evenVBand="0" w:oddHBand="1" w:evenHBand="0" w:firstRowFirstColumn="0" w:firstRowLastColumn="0" w:lastRowFirstColumn="0" w:lastRowLastColumn="0"/>
+          <w:jc w:val="center"/>
+        </w:trPr>
         <w:tc>
           <w:tcPr>
-            <w:tcW w:type="dxa" w:w="2268"/>
+            <w:cnfStyle w:val="001000000000" w:firstRow="0" w:lastRow="0" w:firstColumn="1" w:lastColumn="0" w:oddVBand="0" w:evenVBand="0" w:oddHBand="0" w:evenHBand="0" w:firstRowFirstColumn="0" w:firstRowLastColumn="0" w:lastRowFirstColumn="0" w:lastRowLastColumn="0"/>
+            <w:tcW w:w="2268" w:type="dxa"/>
           </w:tcPr>
           <w:p>
             <w:r>
@@ -579,9 +599,12 @@
         </w:tc>
         <w:tc>
           <w:tcPr>
-            <w:tcW w:type="dxa" w:w="1984"/>
+            <w:tcW w:w="1984" w:type="dxa"/>
           </w:tcPr>
           <w:p>
+            <w:pPr>
+              <w:cnfStyle w:val="000000100000" w:firstRow="0" w:lastRow="0" w:firstColumn="0" w:lastColumn="0" w:oddVBand="0" w:evenVBand="0" w:oddHBand="1" w:evenHBand="0" w:firstRowFirstColumn="0" w:firstRowLastColumn="0" w:lastRowFirstColumn="0" w:lastRowLastColumn="0"/>
+            </w:pPr>
             <w:r>
               <w:t>REAL</w:t>
             </w:r>
@@ -589,9 +612,12 @@
         </w:tc>
         <w:tc>
           <w:tcPr>
-            <w:tcW w:type="dxa" w:w="4535"/>
+            <w:tcW w:w="4535" w:type="dxa"/>
           </w:tcPr>
           <w:p>
+            <w:pPr>
+              <w:cnfStyle w:val="000000100000" w:firstRow="0" w:lastRow="0" w:firstColumn="0" w:lastColumn="0" w:oddVBand="0" w:evenVBand="0" w:oddHBand="1" w:evenHBand="0" w:firstRowFirstColumn="0" w:firstRowLastColumn="0" w:lastRowFirstColumn="0" w:lastRowLastColumn="0"/>
+            </w:pPr>
             <w:r>
               <w:t>Tọa độ vĩ độ / kinh độ</w:t>
             </w:r>
@@ -599,9 +625,14 @@
         </w:tc>
       </w:tr>
       <w:tr>
+        <w:trPr>
+          <w:cnfStyle w:val="000000010000" w:firstRow="0" w:lastRow="0" w:firstColumn="0" w:lastColumn="0" w:oddVBand="0" w:evenVBand="0" w:oddHBand="0" w:evenHBand="1" w:firstRowFirstColumn="0" w:firstRowLastColumn="0" w:lastRowFirstColumn="0" w:lastRowLastColumn="0"/>
+          <w:jc w:val="center"/>
+        </w:trPr>
         <w:tc>
           <w:tcPr>
-            <w:tcW w:type="dxa" w:w="2268"/>
+            <w:cnfStyle w:val="001000000000" w:firstRow="0" w:lastRow="0" w:firstColumn="1" w:lastColumn="0" w:oddVBand="0" w:evenVBand="0" w:oddHBand="0" w:evenHBand="0" w:firstRowFirstColumn="0" w:firstRowLastColumn="0" w:lastRowFirstColumn="0" w:lastRowLastColumn="0"/>
+            <w:tcW w:w="2268" w:type="dxa"/>
           </w:tcPr>
           <w:p>
             <w:r>
@@ -611,9 +642,12 @@
         </w:tc>
         <w:tc>
           <w:tcPr>
-            <w:tcW w:type="dxa" w:w="1984"/>
+            <w:tcW w:w="1984" w:type="dxa"/>
           </w:tcPr>
           <w:p>
+            <w:pPr>
+              <w:cnfStyle w:val="000000010000" w:firstRow="0" w:lastRow="0" w:firstColumn="0" w:lastColumn="0" w:oddVBand="0" w:evenVBand="0" w:oddHBand="0" w:evenHBand="1" w:firstRowFirstColumn="0" w:firstRowLastColumn="0" w:lastRowFirstColumn="0" w:lastRowLastColumn="0"/>
+            </w:pPr>
             <w:r>
               <w:t>TEXT</w:t>
             </w:r>
@@ -621,9 +655,12 @@
         </w:tc>
         <w:tc>
           <w:tcPr>
-            <w:tcW w:type="dxa" w:w="4535"/>
+            <w:tcW w:w="4535" w:type="dxa"/>
           </w:tcPr>
           <w:p>
+            <w:pPr>
+              <w:cnfStyle w:val="000000010000" w:firstRow="0" w:lastRow="0" w:firstColumn="0" w:lastColumn="0" w:oddVBand="0" w:evenVBand="0" w:oddHBand="0" w:evenHBand="1" w:firstRowFirstColumn="0" w:firstRowLastColumn="0" w:lastRowFirstColumn="0" w:lastRowLastColumn="0"/>
+            </w:pPr>
             <w:r>
               <w:t>food | cafe | lodging | attraction</w:t>
             </w:r>
@@ -631,9 +668,14 @@
         </w:tc>
       </w:tr>
       <w:tr>
+        <w:trPr>
+          <w:cnfStyle w:val="000000100000" w:firstRow="0" w:lastRow="0" w:firstColumn="0" w:lastColumn="0" w:oddVBand="0" w:evenVBand="0" w:oddHBand="1" w:evenHBand="0" w:firstRowFirstColumn="0" w:firstRowLastColumn="0" w:lastRowFirstColumn="0" w:lastRowLastColumn="0"/>
+          <w:jc w:val="center"/>
+        </w:trPr>
         <w:tc>
           <w:tcPr>
-            <w:tcW w:type="dxa" w:w="2268"/>
+            <w:cnfStyle w:val="001000000000" w:firstRow="0" w:lastRow="0" w:firstColumn="1" w:lastColumn="0" w:oddVBand="0" w:evenVBand="0" w:oddHBand="0" w:evenHBand="0" w:firstRowFirstColumn="0" w:firstRowLastColumn="0" w:lastRowFirstColumn="0" w:lastRowLastColumn="0"/>
+            <w:tcW w:w="2268" w:type="dxa"/>
           </w:tcPr>
           <w:p>
             <w:r>
@@ -643,9 +685,12 @@
         </w:tc>
         <w:tc>
           <w:tcPr>
-            <w:tcW w:type="dxa" w:w="1984"/>
+            <w:tcW w:w="1984" w:type="dxa"/>
           </w:tcPr>
           <w:p>
+            <w:pPr>
+              <w:cnfStyle w:val="000000100000" w:firstRow="0" w:lastRow="0" w:firstColumn="0" w:lastColumn="0" w:oddVBand="0" w:evenVBand="0" w:oddHBand="1" w:evenHBand="0" w:firstRowFirstColumn="0" w:firstRowLastColumn="0" w:lastRowFirstColumn="0" w:lastRowLastColumn="0"/>
+            </w:pPr>
             <w:r>
               <w:t>TEXT</w:t>
             </w:r>
@@ -653,9 +698,12 @@
         </w:tc>
         <w:tc>
           <w:tcPr>
-            <w:tcW w:type="dxa" w:w="4535"/>
+            <w:tcW w:w="4535" w:type="dxa"/>
           </w:tcPr>
           <w:p>
+            <w:pPr>
+              <w:cnfStyle w:val="000000100000" w:firstRow="0" w:lastRow="0" w:firstColumn="0" w:lastColumn="0" w:oddVBand="0" w:evenVBand="0" w:oddHBand="1" w:evenHBand="0" w:firstRowFirstColumn="0" w:firstRowLastColumn="0" w:lastRowFirstColumn="0" w:lastRowLastColumn="0"/>
+            </w:pPr>
             <w:r>
               <w:t>Tag OSM gốc, vd amenity=restaurant</w:t>
             </w:r>
@@ -663,9 +711,14 @@
         </w:tc>
       </w:tr>
       <w:tr>
+        <w:trPr>
+          <w:cnfStyle w:val="000000010000" w:firstRow="0" w:lastRow="0" w:firstColumn="0" w:lastColumn="0" w:oddVBand="0" w:evenVBand="0" w:oddHBand="0" w:evenHBand="1" w:firstRowFirstColumn="0" w:firstRowLastColumn="0" w:lastRowFirstColumn="0" w:lastRowLastColumn="0"/>
+          <w:jc w:val="center"/>
+        </w:trPr>
         <w:tc>
           <w:tcPr>
-            <w:tcW w:type="dxa" w:w="2268"/>
+            <w:cnfStyle w:val="001000000000" w:firstRow="0" w:lastRow="0" w:firstColumn="1" w:lastColumn="0" w:oddVBand="0" w:evenVBand="0" w:oddHBand="0" w:evenHBand="0" w:firstRowFirstColumn="0" w:firstRowLastColumn="0" w:lastRowFirstColumn="0" w:lastRowLastColumn="0"/>
+            <w:tcW w:w="2268" w:type="dxa"/>
           </w:tcPr>
           <w:p>
             <w:r>
@@ -675,9 +728,12 @@
         </w:tc>
         <w:tc>
           <w:tcPr>
-            <w:tcW w:type="dxa" w:w="1984"/>
+            <w:tcW w:w="1984" w:type="dxa"/>
           </w:tcPr>
           <w:p>
+            <w:pPr>
+              <w:cnfStyle w:val="000000010000" w:firstRow="0" w:lastRow="0" w:firstColumn="0" w:lastColumn="0" w:oddVBand="0" w:evenVBand="0" w:oddHBand="0" w:evenHBand="1" w:firstRowFirstColumn="0" w:firstRowLastColumn="0" w:lastRowFirstColumn="0" w:lastRowLastColumn="0"/>
+            </w:pPr>
             <w:r>
               <w:t>TEXT</w:t>
             </w:r>
@@ -685,9 +741,12 @@
         </w:tc>
         <w:tc>
           <w:tcPr>
-            <w:tcW w:type="dxa" w:w="4535"/>
+            <w:tcW w:w="4535" w:type="dxa"/>
           </w:tcPr>
           <w:p>
+            <w:pPr>
+              <w:cnfStyle w:val="000000010000" w:firstRow="0" w:lastRow="0" w:firstColumn="0" w:lastColumn="0" w:oddVBand="0" w:evenVBand="0" w:oddHBand="0" w:evenHBand="1" w:firstRowFirstColumn="0" w:firstRowLastColumn="0" w:lastRowFirstColumn="0" w:lastRowLastColumn="0"/>
+            </w:pPr>
             <w:r>
               <w:t>Quận/phường từ tag addr:* (nếu có)</w:t>
             </w:r>
@@ -695,9 +754,14 @@
         </w:tc>
       </w:tr>
       <w:tr>
+        <w:trPr>
+          <w:cnfStyle w:val="000000100000" w:firstRow="0" w:lastRow="0" w:firstColumn="0" w:lastColumn="0" w:oddVBand="0" w:evenVBand="0" w:oddHBand="1" w:evenHBand="0" w:firstRowFirstColumn="0" w:firstRowLastColumn="0" w:lastRowFirstColumn="0" w:lastRowLastColumn="0"/>
+          <w:jc w:val="center"/>
+        </w:trPr>
         <w:tc>
           <w:tcPr>
-            <w:tcW w:type="dxa" w:w="2268"/>
+            <w:cnfStyle w:val="001000000000" w:firstRow="0" w:lastRow="0" w:firstColumn="1" w:lastColumn="0" w:oddVBand="0" w:evenVBand="0" w:oddHBand="0" w:evenHBand="0" w:firstRowFirstColumn="0" w:firstRowLastColumn="0" w:lastRowFirstColumn="0" w:lastRowLastColumn="0"/>
+            <w:tcW w:w="2268" w:type="dxa"/>
           </w:tcPr>
           <w:p>
             <w:r>
@@ -707,9 +771,12 @@
         </w:tc>
         <w:tc>
           <w:tcPr>
-            <w:tcW w:type="dxa" w:w="1984"/>
+            <w:tcW w:w="1984" w:type="dxa"/>
           </w:tcPr>
           <w:p>
+            <w:pPr>
+              <w:cnfStyle w:val="000000100000" w:firstRow="0" w:lastRow="0" w:firstColumn="0" w:lastColumn="0" w:oddVBand="0" w:evenVBand="0" w:oddHBand="1" w:evenHBand="0" w:firstRowFirstColumn="0" w:firstRowLastColumn="0" w:lastRowFirstColumn="0" w:lastRowLastColumn="0"/>
+            </w:pPr>
             <w:r>
               <w:t>TEXT</w:t>
             </w:r>
@@ -717,9 +784,12 @@
         </w:tc>
         <w:tc>
           <w:tcPr>
-            <w:tcW w:type="dxa" w:w="4535"/>
+            <w:tcW w:w="4535" w:type="dxa"/>
           </w:tcPr>
           <w:p>
+            <w:pPr>
+              <w:cnfStyle w:val="000000100000" w:firstRow="0" w:lastRow="0" w:firstColumn="0" w:lastColumn="0" w:oddVBand="0" w:evenVBand="0" w:oddHBand="1" w:evenHBand="0" w:firstRowFirstColumn="0" w:firstRowLastColumn="0" w:lastRowFirstColumn="0" w:lastRowLastColumn="0"/>
+            </w:pPr>
             <w:r>
               <w:t>Địa chỉ ghép từ tag addr:* của OSM</w:t>
             </w:r>
@@ -727,9 +797,14 @@
         </w:tc>
       </w:tr>
       <w:tr>
+        <w:trPr>
+          <w:cnfStyle w:val="000000010000" w:firstRow="0" w:lastRow="0" w:firstColumn="0" w:lastColumn="0" w:oddVBand="0" w:evenVBand="0" w:oddHBand="0" w:evenHBand="1" w:firstRowFirstColumn="0" w:firstRowLastColumn="0" w:lastRowFirstColumn="0" w:lastRowLastColumn="0"/>
+          <w:jc w:val="center"/>
+        </w:trPr>
         <w:tc>
           <w:tcPr>
-            <w:tcW w:type="dxa" w:w="2268"/>
+            <w:cnfStyle w:val="001000000000" w:firstRow="0" w:lastRow="0" w:firstColumn="1" w:lastColumn="0" w:oddVBand="0" w:evenVBand="0" w:oddHBand="0" w:evenHBand="0" w:firstRowFirstColumn="0" w:firstRowLastColumn="0" w:lastRowFirstColumn="0" w:lastRowLastColumn="0"/>
+            <w:tcW w:w="2268" w:type="dxa"/>
           </w:tcPr>
           <w:p>
             <w:r>
@@ -739,9 +814,12 @@
         </w:tc>
         <w:tc>
           <w:tcPr>
-            <w:tcW w:type="dxa" w:w="1984"/>
+            <w:tcW w:w="1984" w:type="dxa"/>
           </w:tcPr>
           <w:p>
+            <w:pPr>
+              <w:cnfStyle w:val="000000010000" w:firstRow="0" w:lastRow="0" w:firstColumn="0" w:lastColumn="0" w:oddVBand="0" w:evenVBand="0" w:oddHBand="0" w:evenHBand="1" w:firstRowFirstColumn="0" w:firstRowLastColumn="0" w:lastRowFirstColumn="0" w:lastRowLastColumn="0"/>
+            </w:pPr>
             <w:r>
               <w:t>TEXT</w:t>
             </w:r>
@@ -749,9 +827,12 @@
         </w:tc>
         <w:tc>
           <w:tcPr>
-            <w:tcW w:type="dxa" w:w="4535"/>
+            <w:tcW w:w="4535" w:type="dxa"/>
           </w:tcPr>
           <w:p>
+            <w:pPr>
+              <w:cnfStyle w:val="000000010000" w:firstRow="0" w:lastRow="0" w:firstColumn="0" w:lastColumn="0" w:oddVBand="0" w:evenVBand="0" w:oddHBand="0" w:evenHBand="1" w:firstRowFirstColumn="0" w:firstRowLastColumn="0" w:lastRowFirstColumn="0" w:lastRowLastColumn="0"/>
+            </w:pPr>
             <w:r>
               <w:t>Địa chỉ chuẩn từ Google (nếu làm giàu; hiện trống)</w:t>
             </w:r>
@@ -759,9 +840,14 @@
         </w:tc>
       </w:tr>
       <w:tr>
+        <w:trPr>
+          <w:cnfStyle w:val="000000100000" w:firstRow="0" w:lastRow="0" w:firstColumn="0" w:lastColumn="0" w:oddVBand="0" w:evenVBand="0" w:oddHBand="1" w:evenHBand="0" w:firstRowFirstColumn="0" w:firstRowLastColumn="0" w:lastRowFirstColumn="0" w:lastRowLastColumn="0"/>
+          <w:jc w:val="center"/>
+        </w:trPr>
         <w:tc>
           <w:tcPr>
-            <w:tcW w:type="dxa" w:w="2268"/>
+            <w:cnfStyle w:val="001000000000" w:firstRow="0" w:lastRow="0" w:firstColumn="1" w:lastColumn="0" w:oddVBand="0" w:evenVBand="0" w:oddHBand="0" w:evenHBand="0" w:firstRowFirstColumn="0" w:firstRowLastColumn="0" w:lastRowFirstColumn="0" w:lastRowLastColumn="0"/>
+            <w:tcW w:w="2268" w:type="dxa"/>
           </w:tcPr>
           <w:p>
             <w:r>
@@ -771,9 +857,12 @@
         </w:tc>
         <w:tc>
           <w:tcPr>
-            <w:tcW w:type="dxa" w:w="1984"/>
+            <w:tcW w:w="1984" w:type="dxa"/>
           </w:tcPr>
           <w:p>
+            <w:pPr>
+              <w:cnfStyle w:val="000000100000" w:firstRow="0" w:lastRow="0" w:firstColumn="0" w:lastColumn="0" w:oddVBand="0" w:evenVBand="0" w:oddHBand="1" w:evenHBand="0" w:firstRowFirstColumn="0" w:firstRowLastColumn="0" w:lastRowFirstColumn="0" w:lastRowLastColumn="0"/>
+            </w:pPr>
             <w:r>
               <w:t>TEXT</w:t>
             </w:r>
@@ -781,9 +870,12 @@
         </w:tc>
         <w:tc>
           <w:tcPr>
-            <w:tcW w:type="dxa" w:w="4535"/>
+            <w:tcW w:w="4535" w:type="dxa"/>
           </w:tcPr>
           <w:p>
+            <w:pPr>
+              <w:cnfStyle w:val="000000100000" w:firstRow="0" w:lastRow="0" w:firstColumn="0" w:lastColumn="0" w:oddVBand="0" w:evenVBand="0" w:oddHBand="1" w:evenHBand="0" w:firstRowFirstColumn="0" w:firstRowLastColumn="0" w:lastRowFirstColumn="0" w:lastRowLastColumn="0"/>
+            </w:pPr>
             <w:r>
               <w:t>Chuỗi giờ mở cửa kiểu OSM, vd Mo-Su 08:00-22:00</w:t>
             </w:r>
@@ -791,9 +883,14 @@
         </w:tc>
       </w:tr>
       <w:tr>
+        <w:trPr>
+          <w:cnfStyle w:val="000000010000" w:firstRow="0" w:lastRow="0" w:firstColumn="0" w:lastColumn="0" w:oddVBand="0" w:evenVBand="0" w:oddHBand="0" w:evenHBand="1" w:firstRowFirstColumn="0" w:firstRowLastColumn="0" w:lastRowFirstColumn="0" w:lastRowLastColumn="0"/>
+          <w:jc w:val="center"/>
+        </w:trPr>
         <w:tc>
           <w:tcPr>
-            <w:tcW w:type="dxa" w:w="2268"/>
+            <w:cnfStyle w:val="001000000000" w:firstRow="0" w:lastRow="0" w:firstColumn="1" w:lastColumn="0" w:oddVBand="0" w:evenVBand="0" w:oddHBand="0" w:evenHBand="0" w:firstRowFirstColumn="0" w:firstRowLastColumn="0" w:lastRowFirstColumn="0" w:lastRowLastColumn="0"/>
+            <w:tcW w:w="2268" w:type="dxa"/>
           </w:tcPr>
           <w:p>
             <w:r>
@@ -803,9 +900,12 @@
         </w:tc>
         <w:tc>
           <w:tcPr>
-            <w:tcW w:type="dxa" w:w="1984"/>
+            <w:tcW w:w="1984" w:type="dxa"/>
           </w:tcPr>
           <w:p>
+            <w:pPr>
+              <w:cnfStyle w:val="000000010000" w:firstRow="0" w:lastRow="0" w:firstColumn="0" w:lastColumn="0" w:oddVBand="0" w:evenVBand="0" w:oddHBand="0" w:evenHBand="1" w:firstRowFirstColumn="0" w:firstRowLastColumn="0" w:lastRowFirstColumn="0" w:lastRowLastColumn="0"/>
+            </w:pPr>
             <w:r>
               <w:t>TEXT</w:t>
             </w:r>
@@ -813,9 +913,12 @@
         </w:tc>
         <w:tc>
           <w:tcPr>
-            <w:tcW w:type="dxa" w:w="4535"/>
+            <w:tcW w:w="4535" w:type="dxa"/>
           </w:tcPr>
           <w:p>
+            <w:pPr>
+              <w:cnfStyle w:val="000000010000" w:firstRow="0" w:lastRow="0" w:firstColumn="0" w:lastColumn="0" w:oddVBand="0" w:evenVBand="0" w:oddHBand="0" w:evenHBand="1" w:firstRowFirstColumn="0" w:firstRowLastColumn="0" w:lastRowFirstColumn="0" w:lastRowLastColumn="0"/>
+            </w:pPr>
             <w:r>
               <w:t>Nguồn của giờ: osm | google | heuristic | manual</w:t>
             </w:r>
@@ -823,9 +926,14 @@
         </w:tc>
       </w:tr>
       <w:tr>
+        <w:trPr>
+          <w:cnfStyle w:val="000000100000" w:firstRow="0" w:lastRow="0" w:firstColumn="0" w:lastColumn="0" w:oddVBand="0" w:evenVBand="0" w:oddHBand="1" w:evenHBand="0" w:firstRowFirstColumn="0" w:firstRowLastColumn="0" w:lastRowFirstColumn="0" w:lastRowLastColumn="0"/>
+          <w:jc w:val="center"/>
+        </w:trPr>
         <w:tc>
           <w:tcPr>
-            <w:tcW w:type="dxa" w:w="2268"/>
+            <w:cnfStyle w:val="001000000000" w:firstRow="0" w:lastRow="0" w:firstColumn="1" w:lastColumn="0" w:oddVBand="0" w:evenVBand="0" w:oddHBand="0" w:evenHBand="0" w:firstRowFirstColumn="0" w:firstRowLastColumn="0" w:lastRowFirstColumn="0" w:lastRowLastColumn="0"/>
+            <w:tcW w:w="2268" w:type="dxa"/>
           </w:tcPr>
           <w:p>
             <w:r>
@@ -835,9 +943,12 @@
         </w:tc>
         <w:tc>
           <w:tcPr>
-            <w:tcW w:type="dxa" w:w="1984"/>
+            <w:tcW w:w="1984" w:type="dxa"/>
           </w:tcPr>
           <w:p>
+            <w:pPr>
+              <w:cnfStyle w:val="000000100000" w:firstRow="0" w:lastRow="0" w:firstColumn="0" w:lastColumn="0" w:oddVBand="0" w:evenVBand="0" w:oddHBand="1" w:evenHBand="0" w:firstRowFirstColumn="0" w:firstRowLastColumn="0" w:lastRowFirstColumn="0" w:lastRowLastColumn="0"/>
+            </w:pPr>
             <w:r>
               <w:t>TEXT</w:t>
             </w:r>
@@ -845,9 +956,12 @@
         </w:tc>
         <w:tc>
           <w:tcPr>
-            <w:tcW w:type="dxa" w:w="4535"/>
+            <w:tcW w:w="4535" w:type="dxa"/>
           </w:tcPr>
           <w:p>
+            <w:pPr>
+              <w:cnfStyle w:val="000000100000" w:firstRow="0" w:lastRow="0" w:firstColumn="0" w:lastColumn="0" w:oddVBand="0" w:evenVBand="0" w:oddHBand="1" w:evenHBand="0" w:firstRowFirstColumn="0" w:firstRowLastColumn="0" w:lastRowFirstColumn="0" w:lastRowLastColumn="0"/>
+            </w:pPr>
             <w:r>
               <w:t>Google Place ID (nếu làm giàu)</w:t>
             </w:r>
@@ -855,9 +969,14 @@
         </w:tc>
       </w:tr>
       <w:tr>
+        <w:trPr>
+          <w:cnfStyle w:val="000000010000" w:firstRow="0" w:lastRow="0" w:firstColumn="0" w:lastColumn="0" w:oddVBand="0" w:evenVBand="0" w:oddHBand="0" w:evenHBand="1" w:firstRowFirstColumn="0" w:firstRowLastColumn="0" w:lastRowFirstColumn="0" w:lastRowLastColumn="0"/>
+          <w:jc w:val="center"/>
+        </w:trPr>
         <w:tc>
           <w:tcPr>
-            <w:tcW w:type="dxa" w:w="2268"/>
+            <w:cnfStyle w:val="001000000000" w:firstRow="0" w:lastRow="0" w:firstColumn="1" w:lastColumn="0" w:oddVBand="0" w:evenVBand="0" w:oddHBand="0" w:evenHBand="0" w:firstRowFirstColumn="0" w:firstRowLastColumn="0" w:lastRowFirstColumn="0" w:lastRowLastColumn="0"/>
+            <w:tcW w:w="2268" w:type="dxa"/>
           </w:tcPr>
           <w:p>
             <w:r>
@@ -867,9 +986,12 @@
         </w:tc>
         <w:tc>
           <w:tcPr>
-            <w:tcW w:type="dxa" w:w="1984"/>
+            <w:tcW w:w="1984" w:type="dxa"/>
           </w:tcPr>
           <w:p>
+            <w:pPr>
+              <w:cnfStyle w:val="000000010000" w:firstRow="0" w:lastRow="0" w:firstColumn="0" w:lastColumn="0" w:oddVBand="0" w:evenVBand="0" w:oddHBand="0" w:evenHBand="1" w:firstRowFirstColumn="0" w:firstRowLastColumn="0" w:lastRowFirstColumn="0" w:lastRowLastColumn="0"/>
+            </w:pPr>
             <w:r>
               <w:t>TEXT</w:t>
             </w:r>
@@ -877,9 +999,12 @@
         </w:tc>
         <w:tc>
           <w:tcPr>
-            <w:tcW w:type="dxa" w:w="4535"/>
+            <w:tcW w:w="4535" w:type="dxa"/>
           </w:tcPr>
           <w:p>
+            <w:pPr>
+              <w:cnfStyle w:val="000000010000" w:firstRow="0" w:lastRow="0" w:firstColumn="0" w:lastColumn="0" w:oddVBand="0" w:evenVBand="0" w:oddHBand="0" w:evenHBand="1" w:firstRowFirstColumn="0" w:firstRowLastColumn="0" w:lastRowFirstColumn="0" w:lastRowLastColumn="0"/>
+            </w:pPr>
             <w:r>
               <w:t>OPERATIONAL | CLOSED_TEMPORARILY | CLOSED_PERMANENTLY</w:t>
             </w:r>
@@ -887,9 +1012,14 @@
         </w:tc>
       </w:tr>
       <w:tr>
+        <w:trPr>
+          <w:cnfStyle w:val="000000100000" w:firstRow="0" w:lastRow="0" w:firstColumn="0" w:lastColumn="0" w:oddVBand="0" w:evenVBand="0" w:oddHBand="1" w:evenHBand="0" w:firstRowFirstColumn="0" w:firstRowLastColumn="0" w:lastRowFirstColumn="0" w:lastRowLastColumn="0"/>
+          <w:jc w:val="center"/>
+        </w:trPr>
         <w:tc>
           <w:tcPr>
-            <w:tcW w:type="dxa" w:w="2268"/>
+            <w:cnfStyle w:val="001000000000" w:firstRow="0" w:lastRow="0" w:firstColumn="1" w:lastColumn="0" w:oddVBand="0" w:evenVBand="0" w:oddHBand="0" w:evenHBand="0" w:firstRowFirstColumn="0" w:firstRowLastColumn="0" w:lastRowFirstColumn="0" w:lastRowLastColumn="0"/>
+            <w:tcW w:w="2268" w:type="dxa"/>
           </w:tcPr>
           <w:p>
             <w:r>
@@ -899,9 +1029,12 @@
         </w:tc>
         <w:tc>
           <w:tcPr>
-            <w:tcW w:type="dxa" w:w="1984"/>
+            <w:tcW w:w="1984" w:type="dxa"/>
           </w:tcPr>
           <w:p>
+            <w:pPr>
+              <w:cnfStyle w:val="000000100000" w:firstRow="0" w:lastRow="0" w:firstColumn="0" w:lastColumn="0" w:oddVBand="0" w:evenVBand="0" w:oddHBand="1" w:evenHBand="0" w:firstRowFirstColumn="0" w:firstRowLastColumn="0" w:lastRowFirstColumn="0" w:lastRowLastColumn="0"/>
+            </w:pPr>
             <w:r>
               <w:t>INTEGER</w:t>
             </w:r>
@@ -909,9 +1042,12 @@
         </w:tc>
         <w:tc>
           <w:tcPr>
-            <w:tcW w:type="dxa" w:w="4535"/>
+            <w:tcW w:w="4535" w:type="dxa"/>
           </w:tcPr>
           <w:p>
+            <w:pPr>
+              <w:cnfStyle w:val="000000100000" w:firstRow="0" w:lastRow="0" w:firstColumn="0" w:lastColumn="0" w:oddVBand="0" w:evenVBand="0" w:oddHBand="1" w:evenHBand="0" w:firstRowFirstColumn="0" w:firstRowLastColumn="0" w:lastRowFirstColumn="0" w:lastRowLastColumn="0"/>
+            </w:pPr>
             <w:r>
               <w:t>Mức giá 1..3</w:t>
             </w:r>
@@ -919,9 +1055,14 @@
         </w:tc>
       </w:tr>
       <w:tr>
+        <w:trPr>
+          <w:cnfStyle w:val="000000010000" w:firstRow="0" w:lastRow="0" w:firstColumn="0" w:lastColumn="0" w:oddVBand="0" w:evenVBand="0" w:oddHBand="0" w:evenHBand="1" w:firstRowFirstColumn="0" w:firstRowLastColumn="0" w:lastRowFirstColumn="0" w:lastRowLastColumn="0"/>
+          <w:jc w:val="center"/>
+        </w:trPr>
         <w:tc>
           <w:tcPr>
-            <w:tcW w:type="dxa" w:w="2268"/>
+            <w:cnfStyle w:val="001000000000" w:firstRow="0" w:lastRow="0" w:firstColumn="1" w:lastColumn="0" w:oddVBand="0" w:evenVBand="0" w:oddHBand="0" w:evenHBand="0" w:firstRowFirstColumn="0" w:firstRowLastColumn="0" w:lastRowFirstColumn="0" w:lastRowLastColumn="0"/>
+            <w:tcW w:w="2268" w:type="dxa"/>
           </w:tcPr>
           <w:p>
             <w:r>
@@ -931,9 +1072,12 @@
         </w:tc>
         <w:tc>
           <w:tcPr>
-            <w:tcW w:type="dxa" w:w="1984"/>
+            <w:tcW w:w="1984" w:type="dxa"/>
           </w:tcPr>
           <w:p>
+            <w:pPr>
+              <w:cnfStyle w:val="000000010000" w:firstRow="0" w:lastRow="0" w:firstColumn="0" w:lastColumn="0" w:oddVBand="0" w:evenVBand="0" w:oddHBand="0" w:evenHBand="1" w:firstRowFirstColumn="0" w:firstRowLastColumn="0" w:lastRowFirstColumn="0" w:lastRowLastColumn="0"/>
+            </w:pPr>
             <w:r>
               <w:t>INTEGER</w:t>
             </w:r>
@@ -941,9 +1085,12 @@
         </w:tc>
         <w:tc>
           <w:tcPr>
-            <w:tcW w:type="dxa" w:w="4535"/>
+            <w:tcW w:w="4535" w:type="dxa"/>
           </w:tcPr>
           <w:p>
+            <w:pPr>
+              <w:cnfStyle w:val="000000010000" w:firstRow="0" w:lastRow="0" w:firstColumn="0" w:lastColumn="0" w:oddVBand="0" w:evenVBand="0" w:oddHBand="0" w:evenHBand="1" w:firstRowFirstColumn="0" w:firstRowLastColumn="0" w:lastRowFirstColumn="0" w:lastRowLastColumn="0"/>
+            </w:pPr>
             <w:r>
               <w:t>1 = ước lượng heuristic, 0 = suy từ dữ liệu thật</w:t>
             </w:r>
@@ -951,9 +1098,14 @@
         </w:tc>
       </w:tr>
       <w:tr>
+        <w:trPr>
+          <w:cnfStyle w:val="000000100000" w:firstRow="0" w:lastRow="0" w:firstColumn="0" w:lastColumn="0" w:oddVBand="0" w:evenVBand="0" w:oddHBand="1" w:evenHBand="0" w:firstRowFirstColumn="0" w:firstRowLastColumn="0" w:lastRowFirstColumn="0" w:lastRowLastColumn="0"/>
+          <w:jc w:val="center"/>
+        </w:trPr>
         <w:tc>
           <w:tcPr>
-            <w:tcW w:type="dxa" w:w="2268"/>
+            <w:cnfStyle w:val="001000000000" w:firstRow="0" w:lastRow="0" w:firstColumn="1" w:lastColumn="0" w:oddVBand="0" w:evenVBand="0" w:oddHBand="0" w:evenHBand="0" w:firstRowFirstColumn="0" w:firstRowLastColumn="0" w:lastRowFirstColumn="0" w:lastRowLastColumn="0"/>
+            <w:tcW w:w="2268" w:type="dxa"/>
           </w:tcPr>
           <w:p>
             <w:r>
@@ -963,9 +1115,12 @@
         </w:tc>
         <w:tc>
           <w:tcPr>
-            <w:tcW w:type="dxa" w:w="1984"/>
+            <w:tcW w:w="1984" w:type="dxa"/>
           </w:tcPr>
           <w:p>
+            <w:pPr>
+              <w:cnfStyle w:val="000000100000" w:firstRow="0" w:lastRow="0" w:firstColumn="0" w:lastColumn="0" w:oddVBand="0" w:evenVBand="0" w:oddHBand="1" w:evenHBand="0" w:firstRowFirstColumn="0" w:firstRowLastColumn="0" w:lastRowFirstColumn="0" w:lastRowLastColumn="0"/>
+            </w:pPr>
             <w:r>
               <w:t>INTEGER</w:t>
             </w:r>
@@ -973,9 +1128,12 @@
         </w:tc>
         <w:tc>
           <w:tcPr>
-            <w:tcW w:type="dxa" w:w="4535"/>
+            <w:tcW w:w="4535" w:type="dxa"/>
           </w:tcPr>
           <w:p>
+            <w:pPr>
+              <w:cnfStyle w:val="000000100000" w:firstRow="0" w:lastRow="0" w:firstColumn="0" w:lastColumn="0" w:oddVBand="0" w:evenVBand="0" w:oddHBand="1" w:evenHBand="0" w:firstRowFirstColumn="0" w:firstRowLastColumn="0" w:lastRowFirstColumn="0" w:lastRowLastColumn="0"/>
+            </w:pPr>
             <w:r>
               <w:t>Thời lượng tham quan ước lượng (phút)</w:t>
             </w:r>
@@ -983,9 +1141,14 @@
         </w:tc>
       </w:tr>
       <w:tr>
+        <w:trPr>
+          <w:cnfStyle w:val="000000010000" w:firstRow="0" w:lastRow="0" w:firstColumn="0" w:lastColumn="0" w:oddVBand="0" w:evenVBand="0" w:oddHBand="0" w:evenHBand="1" w:firstRowFirstColumn="0" w:firstRowLastColumn="0" w:lastRowFirstColumn="0" w:lastRowLastColumn="0"/>
+          <w:jc w:val="center"/>
+        </w:trPr>
         <w:tc>
           <w:tcPr>
-            <w:tcW w:type="dxa" w:w="2268"/>
+            <w:cnfStyle w:val="001000000000" w:firstRow="0" w:lastRow="0" w:firstColumn="1" w:lastColumn="0" w:oddVBand="0" w:evenVBand="0" w:oddHBand="0" w:evenHBand="0" w:firstRowFirstColumn="0" w:firstRowLastColumn="0" w:lastRowFirstColumn="0" w:lastRowLastColumn="0"/>
+            <w:tcW w:w="2268" w:type="dxa"/>
           </w:tcPr>
           <w:p>
             <w:r>
@@ -995,9 +1158,12 @@
         </w:tc>
         <w:tc>
           <w:tcPr>
-            <w:tcW w:type="dxa" w:w="1984"/>
+            <w:tcW w:w="1984" w:type="dxa"/>
           </w:tcPr>
           <w:p>
+            <w:pPr>
+              <w:cnfStyle w:val="000000010000" w:firstRow="0" w:lastRow="0" w:firstColumn="0" w:lastColumn="0" w:oddVBand="0" w:evenVBand="0" w:oddHBand="0" w:evenHBand="1" w:firstRowFirstColumn="0" w:firstRowLastColumn="0" w:lastRowFirstColumn="0" w:lastRowLastColumn="0"/>
+            </w:pPr>
             <w:r>
               <w:t>TEXT</w:t>
             </w:r>
@@ -1005,9 +1171,12 @@
         </w:tc>
         <w:tc>
           <w:tcPr>
-            <w:tcW w:type="dxa" w:w="4535"/>
+            <w:tcW w:w="4535" w:type="dxa"/>
           </w:tcPr>
           <w:p>
+            <w:pPr>
+              <w:cnfStyle w:val="000000010000" w:firstRow="0" w:lastRow="0" w:firstColumn="0" w:lastColumn="0" w:oddVBand="0" w:evenVBand="0" w:oddHBand="0" w:evenHBand="1" w:firstRowFirstColumn="0" w:firstRowLastColumn="0" w:lastRowFirstColumn="0" w:lastRowLastColumn="0"/>
+            </w:pPr>
             <w:r>
               <w:t>Nguồn dữ liệu, vd OpenStreetMap</w:t>
             </w:r>
@@ -1015,9 +1184,14 @@
         </w:tc>
       </w:tr>
       <w:tr>
+        <w:trPr>
+          <w:cnfStyle w:val="000000100000" w:firstRow="0" w:lastRow="0" w:firstColumn="0" w:lastColumn="0" w:oddVBand="0" w:evenVBand="0" w:oddHBand="1" w:evenHBand="0" w:firstRowFirstColumn="0" w:firstRowLastColumn="0" w:lastRowFirstColumn="0" w:lastRowLastColumn="0"/>
+          <w:jc w:val="center"/>
+        </w:trPr>
         <w:tc>
           <w:tcPr>
-            <w:tcW w:type="dxa" w:w="2268"/>
+            <w:cnfStyle w:val="001000000000" w:firstRow="0" w:lastRow="0" w:firstColumn="1" w:lastColumn="0" w:oddVBand="0" w:evenVBand="0" w:oddHBand="0" w:evenHBand="0" w:firstRowFirstColumn="0" w:firstRowLastColumn="0" w:lastRowFirstColumn="0" w:lastRowLastColumn="0"/>
+            <w:tcW w:w="2268" w:type="dxa"/>
           </w:tcPr>
           <w:p>
             <w:r>
@@ -1027,9 +1201,12 @@
         </w:tc>
         <w:tc>
           <w:tcPr>
-            <w:tcW w:type="dxa" w:w="1984"/>
+            <w:tcW w:w="1984" w:type="dxa"/>
           </w:tcPr>
           <w:p>
+            <w:pPr>
+              <w:cnfStyle w:val="000000100000" w:firstRow="0" w:lastRow="0" w:firstColumn="0" w:lastColumn="0" w:oddVBand="0" w:evenVBand="0" w:oddHBand="1" w:evenHBand="0" w:firstRowFirstColumn="0" w:firstRowLastColumn="0" w:lastRowFirstColumn="0" w:lastRowLastColumn="0"/>
+            </w:pPr>
             <w:r>
               <w:t>TEXT</w:t>
             </w:r>
@@ -1037,9 +1214,12 @@
         </w:tc>
         <w:tc>
           <w:tcPr>
-            <w:tcW w:type="dxa" w:w="4535"/>
+            <w:tcW w:w="4535" w:type="dxa"/>
           </w:tcPr>
           <w:p>
+            <w:pPr>
+              <w:cnfStyle w:val="000000100000" w:firstRow="0" w:lastRow="0" w:firstColumn="0" w:lastColumn="0" w:oddVBand="0" w:evenVBand="0" w:oddHBand="1" w:evenHBand="0" w:firstRowFirstColumn="0" w:firstRowLastColumn="0" w:lastRowFirstColumn="0" w:lastRowLastColumn="0"/>
+            </w:pPr>
             <w:r>
               <w:t>Ngày cập nhật (ISO)</w:t>
             </w:r>
@@ -1058,55 +1238,59 @@
     </w:p>
     <w:p>
       <w:r>
-        <w:rPr>
-          <w:i w:val="0"/>
-        </w:rPr>
         <w:t>File data/gold/gold.csv, mỗi dòng một review với nhãn của hai người gán và nhãn chốt.</w:t>
       </w:r>
     </w:p>
     <w:tbl>
       <w:tblPr>
         <w:tblStyle w:val="LightGrid-Accent1"/>
-        <w:tblW w:type="auto" w:w="0"/>
+        <w:tblW w:w="0" w:type="auto"/>
         <w:jc w:val="center"/>
-        <w:tblLook w:firstColumn="1" w:firstRow="1" w:lastColumn="0" w:lastRow="0" w:noHBand="0" w:noVBand="1" w:val="04A0"/>
+        <w:tblLook w:val="04A0" w:firstRow="1" w:lastRow="0" w:firstColumn="1" w:lastColumn="0" w:noHBand="0" w:noVBand="1"/>
       </w:tblPr>
       <w:tblGrid>
-        <w:gridCol w:w="4320"/>
-        <w:gridCol w:w="4320"/>
+        <w:gridCol w:w="1984"/>
+        <w:gridCol w:w="6803"/>
       </w:tblGrid>
       <w:tr>
+        <w:trPr>
+          <w:cnfStyle w:val="100000000000" w:firstRow="1" w:lastRow="0" w:firstColumn="0" w:lastColumn="0" w:oddVBand="0" w:evenVBand="0" w:oddHBand="0" w:evenHBand="0" w:firstRowFirstColumn="0" w:firstRowLastColumn="0" w:lastRowFirstColumn="0" w:lastRowLastColumn="0"/>
+          <w:jc w:val="center"/>
+        </w:trPr>
         <w:tc>
           <w:tcPr>
-            <w:tcW w:type="dxa" w:w="1984"/>
+            <w:cnfStyle w:val="001000000000" w:firstRow="0" w:lastRow="0" w:firstColumn="1" w:lastColumn="0" w:oddVBand="0" w:evenVBand="0" w:oddHBand="0" w:evenHBand="0" w:firstRowFirstColumn="0" w:firstRowLastColumn="0" w:lastRowFirstColumn="0" w:lastRowLastColumn="0"/>
+            <w:tcW w:w="1984" w:type="dxa"/>
           </w:tcPr>
           <w:p>
             <w:r>
-              <w:rPr>
-                <w:b/>
-              </w:rPr>
               <w:t>Cột</w:t>
             </w:r>
           </w:p>
         </w:tc>
         <w:tc>
           <w:tcPr>
-            <w:tcW w:type="dxa" w:w="6803"/>
+            <w:tcW w:w="6803" w:type="dxa"/>
           </w:tcPr>
           <w:p>
+            <w:pPr>
+              <w:cnfStyle w:val="100000000000" w:firstRow="1" w:lastRow="0" w:firstColumn="0" w:lastColumn="0" w:oddVBand="0" w:evenVBand="0" w:oddHBand="0" w:evenHBand="0" w:firstRowFirstColumn="0" w:firstRowLastColumn="0" w:lastRowFirstColumn="0" w:lastRowLastColumn="0"/>
+            </w:pPr>
             <w:r>
-              <w:rPr>
-                <w:b/>
-              </w:rPr>
               <w:t>Ý nghĩa</w:t>
             </w:r>
           </w:p>
         </w:tc>
       </w:tr>
       <w:tr>
+        <w:trPr>
+          <w:cnfStyle w:val="000000100000" w:firstRow="0" w:lastRow="0" w:firstColumn="0" w:lastColumn="0" w:oddVBand="0" w:evenVBand="0" w:oddHBand="1" w:evenHBand="0" w:firstRowFirstColumn="0" w:firstRowLastColumn="0" w:lastRowFirstColumn="0" w:lastRowLastColumn="0"/>
+          <w:jc w:val="center"/>
+        </w:trPr>
         <w:tc>
           <w:tcPr>
-            <w:tcW w:type="dxa" w:w="1984"/>
+            <w:cnfStyle w:val="001000000000" w:firstRow="0" w:lastRow="0" w:firstColumn="1" w:lastColumn="0" w:oddVBand="0" w:evenVBand="0" w:oddHBand="0" w:evenHBand="0" w:firstRowFirstColumn="0" w:firstRowLastColumn="0" w:lastRowFirstColumn="0" w:lastRowLastColumn="0"/>
+            <w:tcW w:w="1984" w:type="dxa"/>
           </w:tcPr>
           <w:p>
             <w:r>
@@ -1116,9 +1300,12 @@
         </w:tc>
         <w:tc>
           <w:tcPr>
-            <w:tcW w:type="dxa" w:w="6803"/>
+            <w:tcW w:w="6803" w:type="dxa"/>
           </w:tcPr>
           <w:p>
+            <w:pPr>
+              <w:cnfStyle w:val="000000100000" w:firstRow="0" w:lastRow="0" w:firstColumn="0" w:lastColumn="0" w:oddVBand="0" w:evenVBand="0" w:oddHBand="1" w:evenHBand="0" w:firstRowFirstColumn="0" w:firstRowLastColumn="0" w:lastRowFirstColumn="0" w:lastRowLastColumn="0"/>
+            </w:pPr>
             <w:r>
               <w:t>Số thứ tự review</w:t>
             </w:r>
@@ -1126,9 +1313,14 @@
         </w:tc>
       </w:tr>
       <w:tr>
+        <w:trPr>
+          <w:cnfStyle w:val="000000010000" w:firstRow="0" w:lastRow="0" w:firstColumn="0" w:lastColumn="0" w:oddVBand="0" w:evenVBand="0" w:oddHBand="0" w:evenHBand="1" w:firstRowFirstColumn="0" w:firstRowLastColumn="0" w:lastRowFirstColumn="0" w:lastRowLastColumn="0"/>
+          <w:jc w:val="center"/>
+        </w:trPr>
         <w:tc>
           <w:tcPr>
-            <w:tcW w:type="dxa" w:w="1984"/>
+            <w:cnfStyle w:val="001000000000" w:firstRow="0" w:lastRow="0" w:firstColumn="1" w:lastColumn="0" w:oddVBand="0" w:evenVBand="0" w:oddHBand="0" w:evenHBand="0" w:firstRowFirstColumn="0" w:firstRowLastColumn="0" w:lastRowFirstColumn="0" w:lastRowLastColumn="0"/>
+            <w:tcW w:w="1984" w:type="dxa"/>
           </w:tcPr>
           <w:p>
             <w:r>
@@ -1138,9 +1330,12 @@
         </w:tc>
         <w:tc>
           <w:tcPr>
-            <w:tcW w:type="dxa" w:w="6803"/>
+            <w:tcW w:w="6803" w:type="dxa"/>
           </w:tcPr>
           <w:p>
+            <w:pPr>
+              <w:cnfStyle w:val="000000010000" w:firstRow="0" w:lastRow="0" w:firstColumn="0" w:lastColumn="0" w:oddVBand="0" w:evenVBand="0" w:oddHBand="0" w:evenHBand="1" w:firstRowFirstColumn="0" w:firstRowLastColumn="0" w:lastRowFirstColumn="0" w:lastRowLastColumn="0"/>
+            </w:pPr>
             <w:r>
               <w:t>Nội dung review tiếng Việt</w:t>
             </w:r>
@@ -1148,9 +1343,14 @@
         </w:tc>
       </w:tr>
       <w:tr>
+        <w:trPr>
+          <w:cnfStyle w:val="000000100000" w:firstRow="0" w:lastRow="0" w:firstColumn="0" w:lastColumn="0" w:oddVBand="0" w:evenVBand="0" w:oddHBand="1" w:evenHBand="0" w:firstRowFirstColumn="0" w:firstRowLastColumn="0" w:lastRowFirstColumn="0" w:lastRowLastColumn="0"/>
+          <w:jc w:val="center"/>
+        </w:trPr>
         <w:tc>
           <w:tcPr>
-            <w:tcW w:type="dxa" w:w="1984"/>
+            <w:cnfStyle w:val="001000000000" w:firstRow="0" w:lastRow="0" w:firstColumn="1" w:lastColumn="0" w:oddVBand="0" w:evenVBand="0" w:oddHBand="0" w:evenHBand="0" w:firstRowFirstColumn="0" w:firstRowLastColumn="0" w:lastRowFirstColumn="0" w:lastRowLastColumn="0"/>
+            <w:tcW w:w="1984" w:type="dxa"/>
           </w:tcPr>
           <w:p>
             <w:r>
@@ -1160,9 +1360,12 @@
         </w:tc>
         <w:tc>
           <w:tcPr>
-            <w:tcW w:type="dxa" w:w="6803"/>
+            <w:tcW w:w="6803" w:type="dxa"/>
           </w:tcPr>
           <w:p>
+            <w:pPr>
+              <w:cnfStyle w:val="000000100000" w:firstRow="0" w:lastRow="0" w:firstColumn="0" w:lastColumn="0" w:oddVBand="0" w:evenVBand="0" w:oddHBand="1" w:evenHBand="0" w:firstRowFirstColumn="0" w:firstRowLastColumn="0" w:lastRowFirstColumn="0" w:lastRowLastColumn="0"/>
+            </w:pPr>
             <w:r>
               <w:t>Nhãn CHỐT dùng làm chuẩn (= annotator2): POS | NEG | NEU</w:t>
             </w:r>
@@ -1170,9 +1373,14 @@
         </w:tc>
       </w:tr>
       <w:tr>
+        <w:trPr>
+          <w:cnfStyle w:val="000000010000" w:firstRow="0" w:lastRow="0" w:firstColumn="0" w:lastColumn="0" w:oddVBand="0" w:evenVBand="0" w:oddHBand="0" w:evenHBand="1" w:firstRowFirstColumn="0" w:firstRowLastColumn="0" w:lastRowFirstColumn="0" w:lastRowLastColumn="0"/>
+          <w:jc w:val="center"/>
+        </w:trPr>
         <w:tc>
           <w:tcPr>
-            <w:tcW w:type="dxa" w:w="1984"/>
+            <w:cnfStyle w:val="001000000000" w:firstRow="0" w:lastRow="0" w:firstColumn="1" w:lastColumn="0" w:oddVBand="0" w:evenVBand="0" w:oddHBand="0" w:evenHBand="0" w:firstRowFirstColumn="0" w:firstRowLastColumn="0" w:lastRowFirstColumn="0" w:lastRowLastColumn="0"/>
+            <w:tcW w:w="1984" w:type="dxa"/>
           </w:tcPr>
           <w:p>
             <w:r>
@@ -1182,9 +1390,12 @@
         </w:tc>
         <w:tc>
           <w:tcPr>
-            <w:tcW w:type="dxa" w:w="6803"/>
+            <w:tcW w:w="6803" w:type="dxa"/>
           </w:tcPr>
           <w:p>
+            <w:pPr>
+              <w:cnfStyle w:val="000000010000" w:firstRow="0" w:lastRow="0" w:firstColumn="0" w:lastColumn="0" w:oddVBand="0" w:evenVBand="0" w:oddHBand="0" w:evenHBand="1" w:firstRowFirstColumn="0" w:firstRowLastColumn="0" w:lastRowFirstColumn="0" w:lastRowLastColumn="0"/>
+            </w:pPr>
             <w:r>
               <w:t>Nhãn của người gán 1 (vòng rà soát)</w:t>
             </w:r>
@@ -1192,9 +1403,14 @@
         </w:tc>
       </w:tr>
       <w:tr>
+        <w:trPr>
+          <w:cnfStyle w:val="000000100000" w:firstRow="0" w:lastRow="0" w:firstColumn="0" w:lastColumn="0" w:oddVBand="0" w:evenVBand="0" w:oddHBand="1" w:evenHBand="0" w:firstRowFirstColumn="0" w:firstRowLastColumn="0" w:lastRowFirstColumn="0" w:lastRowLastColumn="0"/>
+          <w:jc w:val="center"/>
+        </w:trPr>
         <w:tc>
           <w:tcPr>
-            <w:tcW w:type="dxa" w:w="1984"/>
+            <w:cnfStyle w:val="001000000000" w:firstRow="0" w:lastRow="0" w:firstColumn="1" w:lastColumn="0" w:oddVBand="0" w:evenVBand="0" w:oddHBand="0" w:evenHBand="0" w:firstRowFirstColumn="0" w:firstRowLastColumn="0" w:lastRowFirstColumn="0" w:lastRowLastColumn="0"/>
+            <w:tcW w:w="1984" w:type="dxa"/>
           </w:tcPr>
           <w:p>
             <w:r>
@@ -1204,9 +1420,12 @@
         </w:tc>
         <w:tc>
           <w:tcPr>
-            <w:tcW w:type="dxa" w:w="6803"/>
+            <w:tcW w:w="6803" w:type="dxa"/>
           </w:tcPr>
           <w:p>
+            <w:pPr>
+              <w:cnfStyle w:val="000000100000" w:firstRow="0" w:lastRow="0" w:firstColumn="0" w:lastColumn="0" w:oddVBand="0" w:evenVBand="0" w:oddHBand="1" w:evenHBand="0" w:firstRowFirstColumn="0" w:firstRowLastColumn="0" w:lastRowFirstColumn="0" w:lastRowLastColumn="0"/>
+            </w:pPr>
             <w:r>
               <w:t>Nhãn của người gán 2 (người gán chính)</w:t>
             </w:r>
@@ -1214,9 +1433,14 @@
         </w:tc>
       </w:tr>
       <w:tr>
+        <w:trPr>
+          <w:cnfStyle w:val="000000010000" w:firstRow="0" w:lastRow="0" w:firstColumn="0" w:lastColumn="0" w:oddVBand="0" w:evenVBand="0" w:oddHBand="0" w:evenHBand="1" w:firstRowFirstColumn="0" w:firstRowLastColumn="0" w:lastRowFirstColumn="0" w:lastRowLastColumn="0"/>
+          <w:jc w:val="center"/>
+        </w:trPr>
         <w:tc>
           <w:tcPr>
-            <w:tcW w:type="dxa" w:w="1984"/>
+            <w:cnfStyle w:val="001000000000" w:firstRow="0" w:lastRow="0" w:firstColumn="1" w:lastColumn="0" w:oddVBand="0" w:evenVBand="0" w:oddHBand="0" w:evenHBand="0" w:firstRowFirstColumn="0" w:firstRowLastColumn="0" w:lastRowFirstColumn="0" w:lastRowLastColumn="0"/>
+            <w:tcW w:w="1984" w:type="dxa"/>
           </w:tcPr>
           <w:p>
             <w:r>
@@ -1226,9 +1450,12 @@
         </w:tc>
         <w:tc>
           <w:tcPr>
-            <w:tcW w:type="dxa" w:w="6803"/>
+            <w:tcW w:w="6803" w:type="dxa"/>
           </w:tcPr>
           <w:p>
+            <w:pPr>
+              <w:cnfStyle w:val="000000010000" w:firstRow="0" w:lastRow="0" w:firstColumn="0" w:lastColumn="0" w:oddVBand="0" w:evenVBand="0" w:oddHBand="0" w:evenHBand="1" w:firstRowFirstColumn="0" w:firstRowLastColumn="0" w:lastRowFirstColumn="0" w:lastRowLastColumn="0"/>
+            </w:pPr>
             <w:r>
               <w:t>Nguồn review</w:t>
             </w:r>
@@ -1242,52 +1469,60 @@
         <w:pStyle w:val="Heading2"/>
       </w:pPr>
       <w:r>
+        <w:lastRenderedPageBreak/>
         <w:t>2.3 File kiểm chứng &amp; kết quả</w:t>
       </w:r>
     </w:p>
     <w:tbl>
       <w:tblPr>
         <w:tblStyle w:val="LightGrid-Accent1"/>
-        <w:tblW w:type="auto" w:w="0"/>
+        <w:tblW w:w="0" w:type="auto"/>
         <w:jc w:val="center"/>
-        <w:tblLook w:firstColumn="1" w:firstRow="1" w:lastColumn="0" w:lastRow="0" w:noHBand="0" w:noVBand="1" w:val="04A0"/>
+        <w:tblLook w:val="04A0" w:firstRow="1" w:lastRow="0" w:firstColumn="1" w:lastColumn="0" w:noHBand="0" w:noVBand="1"/>
       </w:tblPr>
       <w:tblGrid>
-        <w:gridCol w:w="4320"/>
-        <w:gridCol w:w="4320"/>
+        <w:gridCol w:w="3118"/>
+        <w:gridCol w:w="5669"/>
       </w:tblGrid>
       <w:tr>
+        <w:trPr>
+          <w:cnfStyle w:val="100000000000" w:firstRow="1" w:lastRow="0" w:firstColumn="0" w:lastColumn="0" w:oddVBand="0" w:evenVBand="0" w:oddHBand="0" w:evenHBand="0" w:firstRowFirstColumn="0" w:firstRowLastColumn="0" w:lastRowFirstColumn="0" w:lastRowLastColumn="0"/>
+          <w:jc w:val="center"/>
+        </w:trPr>
         <w:tc>
           <w:tcPr>
-            <w:tcW w:type="dxa" w:w="3118"/>
+            <w:cnfStyle w:val="001000000000" w:firstRow="0" w:lastRow="0" w:firstColumn="1" w:lastColumn="0" w:oddVBand="0" w:evenVBand="0" w:oddHBand="0" w:evenHBand="0" w:firstRowFirstColumn="0" w:firstRowLastColumn="0" w:lastRowFirstColumn="0" w:lastRowLastColumn="0"/>
+            <w:tcW w:w="3118" w:type="dxa"/>
           </w:tcPr>
           <w:p>
             <w:r>
-              <w:rPr>
-                <w:b/>
-              </w:rPr>
               <w:t>Đường dẫn</w:t>
             </w:r>
           </w:p>
         </w:tc>
         <w:tc>
           <w:tcPr>
-            <w:tcW w:type="dxa" w:w="5669"/>
+            <w:tcW w:w="5669" w:type="dxa"/>
           </w:tcPr>
           <w:p>
+            <w:pPr>
+              <w:cnfStyle w:val="100000000000" w:firstRow="1" w:lastRow="0" w:firstColumn="0" w:lastColumn="0" w:oddVBand="0" w:evenVBand="0" w:oddHBand="0" w:evenHBand="0" w:firstRowFirstColumn="0" w:firstRowLastColumn="0" w:lastRowFirstColumn="0" w:lastRowLastColumn="0"/>
+            </w:pPr>
             <w:r>
-              <w:rPr>
-                <w:b/>
-              </w:rPr>
               <w:t>Nội dung</w:t>
             </w:r>
           </w:p>
         </w:tc>
       </w:tr>
       <w:tr>
+        <w:trPr>
+          <w:cnfStyle w:val="000000100000" w:firstRow="0" w:lastRow="0" w:firstColumn="0" w:lastColumn="0" w:oddVBand="0" w:evenVBand="0" w:oddHBand="1" w:evenHBand="0" w:firstRowFirstColumn="0" w:firstRowLastColumn="0" w:lastRowFirstColumn="0" w:lastRowLastColumn="0"/>
+          <w:jc w:val="center"/>
+        </w:trPr>
         <w:tc>
           <w:tcPr>
-            <w:tcW w:type="dxa" w:w="3118"/>
+            <w:cnfStyle w:val="001000000000" w:firstRow="0" w:lastRow="0" w:firstColumn="1" w:lastColumn="0" w:oddVBand="0" w:evenVBand="0" w:oddHBand="0" w:evenHBand="0" w:firstRowFirstColumn="0" w:firstRowLastColumn="0" w:lastRowFirstColumn="0" w:lastRowLastColumn="0"/>
+            <w:tcW w:w="3118" w:type="dxa"/>
           </w:tcPr>
           <w:p>
             <w:r>
@@ -1297,9 +1532,12 @@
         </w:tc>
         <w:tc>
           <w:tcPr>
-            <w:tcW w:type="dxa" w:w="5669"/>
+            <w:tcW w:w="5669" w:type="dxa"/>
           </w:tcPr>
           <w:p>
+            <w:pPr>
+              <w:cnfStyle w:val="000000100000" w:firstRow="0" w:lastRow="0" w:firstColumn="0" w:lastColumn="0" w:oddVBand="0" w:evenVBand="0" w:oddHBand="1" w:evenHBand="0" w:firstRowFirstColumn="0" w:firstRowLastColumn="0" w:lastRowFirstColumn="0" w:lastRowLastColumn="0"/>
+            </w:pPr>
             <w:r>
               <w:t>SQLite — bảng pois (500 địa điểm)</w:t>
             </w:r>
@@ -1307,9 +1545,14 @@
         </w:tc>
       </w:tr>
       <w:tr>
+        <w:trPr>
+          <w:cnfStyle w:val="000000010000" w:firstRow="0" w:lastRow="0" w:firstColumn="0" w:lastColumn="0" w:oddVBand="0" w:evenVBand="0" w:oddHBand="0" w:evenHBand="1" w:firstRowFirstColumn="0" w:firstRowLastColumn="0" w:lastRowFirstColumn="0" w:lastRowLastColumn="0"/>
+          <w:jc w:val="center"/>
+        </w:trPr>
         <w:tc>
           <w:tcPr>
-            <w:tcW w:type="dxa" w:w="3118"/>
+            <w:cnfStyle w:val="001000000000" w:firstRow="0" w:lastRow="0" w:firstColumn="1" w:lastColumn="0" w:oddVBand="0" w:evenVBand="0" w:oddHBand="0" w:evenHBand="0" w:firstRowFirstColumn="0" w:firstRowLastColumn="0" w:lastRowFirstColumn="0" w:lastRowLastColumn="0"/>
+            <w:tcW w:w="3118" w:type="dxa"/>
           </w:tcPr>
           <w:p>
             <w:r>
@@ -1319,9 +1562,12 @@
         </w:tc>
         <w:tc>
           <w:tcPr>
-            <w:tcW w:type="dxa" w:w="5669"/>
+            <w:tcW w:w="5669" w:type="dxa"/>
           </w:tcPr>
           <w:p>
+            <w:pPr>
+              <w:cnfStyle w:val="000000010000" w:firstRow="0" w:lastRow="0" w:firstColumn="0" w:lastColumn="0" w:oddVBand="0" w:evenVBand="0" w:oddHBand="0" w:evenHBand="1" w:firstRowFirstColumn="0" w:firstRowLastColumn="0" w:lastRowFirstColumn="0" w:lastRowLastColumn="0"/>
+            </w:pPr>
             <w:r>
               <w:t>Tập gold cảm xúc (493 review đã gán)</w:t>
             </w:r>
@@ -1329,9 +1575,14 @@
         </w:tc>
       </w:tr>
       <w:tr>
+        <w:trPr>
+          <w:cnfStyle w:val="000000100000" w:firstRow="0" w:lastRow="0" w:firstColumn="0" w:lastColumn="0" w:oddVBand="0" w:evenVBand="0" w:oddHBand="1" w:evenHBand="0" w:firstRowFirstColumn="0" w:firstRowLastColumn="0" w:lastRowFirstColumn="0" w:lastRowLastColumn="0"/>
+          <w:jc w:val="center"/>
+        </w:trPr>
         <w:tc>
           <w:tcPr>
-            <w:tcW w:type="dxa" w:w="3118"/>
+            <w:cnfStyle w:val="001000000000" w:firstRow="0" w:lastRow="0" w:firstColumn="1" w:lastColumn="0" w:oddVBand="0" w:evenVBand="0" w:oddHBand="0" w:evenHBand="0" w:firstRowFirstColumn="0" w:firstRowLastColumn="0" w:lastRowFirstColumn="0" w:lastRowLastColumn="0"/>
+            <w:tcW w:w="3118" w:type="dxa"/>
           </w:tcPr>
           <w:p>
             <w:r>
@@ -1341,9 +1592,12 @@
         </w:tc>
         <w:tc>
           <w:tcPr>
-            <w:tcW w:type="dxa" w:w="5669"/>
+            <w:tcW w:w="5669" w:type="dxa"/>
           </w:tcPr>
           <w:p>
+            <w:pPr>
+              <w:cnfStyle w:val="000000100000" w:firstRow="0" w:lastRow="0" w:firstColumn="0" w:lastColumn="0" w:oddVBand="0" w:evenVBand="0" w:oddHBand="1" w:evenHBand="0" w:firstRowFirstColumn="0" w:firstRowLastColumn="0" w:lastRowFirstColumn="0" w:lastRowLastColumn="0"/>
+            </w:pPr>
             <w:r>
               <w:t>50 địa điểm đã kiểm tay (coord_dung / hours_dung)</w:t>
             </w:r>
@@ -1351,9 +1605,14 @@
         </w:tc>
       </w:tr>
       <w:tr>
+        <w:trPr>
+          <w:cnfStyle w:val="000000010000" w:firstRow="0" w:lastRow="0" w:firstColumn="0" w:lastColumn="0" w:oddVBand="0" w:evenVBand="0" w:oddHBand="0" w:evenHBand="1" w:firstRowFirstColumn="0" w:firstRowLastColumn="0" w:lastRowFirstColumn="0" w:lastRowLastColumn="0"/>
+          <w:jc w:val="center"/>
+        </w:trPr>
         <w:tc>
           <w:tcPr>
-            <w:tcW w:type="dxa" w:w="3118"/>
+            <w:cnfStyle w:val="001000000000" w:firstRow="0" w:lastRow="0" w:firstColumn="1" w:lastColumn="0" w:oddVBand="0" w:evenVBand="0" w:oddHBand="0" w:evenHBand="0" w:firstRowFirstColumn="0" w:firstRowLastColumn="0" w:lastRowFirstColumn="0" w:lastRowLastColumn="0"/>
+            <w:tcW w:w="3118" w:type="dxa"/>
           </w:tcPr>
           <w:p>
             <w:r>
@@ -1363,9 +1622,12 @@
         </w:tc>
         <w:tc>
           <w:tcPr>
-            <w:tcW w:type="dxa" w:w="5669"/>
+            <w:tcW w:w="5669" w:type="dxa"/>
           </w:tcPr>
           <w:p>
+            <w:pPr>
+              <w:cnfStyle w:val="000000010000" w:firstRow="0" w:lastRow="0" w:firstColumn="0" w:lastColumn="0" w:oddVBand="0" w:evenVBand="0" w:oddHBand="0" w:evenHBand="1" w:firstRowFirstColumn="0" w:firstRowLastColumn="0" w:lastRowFirstColumn="0" w:lastRowLastColumn="0"/>
+            </w:pPr>
             <w:r>
               <w:t>Kết quả sinh tự động: báo cáo, biểu đồ, ma trận nhầm lẫn</w:t>
             </w:r>
@@ -1386,10 +1648,73 @@
     </w:p>
     <w:p>
       <w:pPr>
+        <w:pStyle w:val="Heading2"/>
+      </w:pPr>
+      <w:r>
+        <w:t>2.4 Dữ liệu này phục vụ app WiseTravel chính thức thế nào</w:t>
+      </w:r>
+    </w:p>
+    <w:p>
+      <w:r>
+        <w:rPr>
+          <w:b w:val="0"/>
+        </w:rPr>
+        <w:t>Đồ án tạo ra hai thành phần sẵn sàng đưa vào sản phẩm:</w:t>
+      </w:r>
+    </w:p>
+    <w:p>
+      <w:pPr>
+        <w:pStyle w:val="ListNumber"/>
+      </w:pPr>
+      <w:r>
+        <w:rPr>
+          <w:b/>
+        </w:rPr>
+        <w:t>Kho địa điểm (bảng pois)</w:t>
+      </w:r>
+      <w:r>
+        <w:t xml:space="preserve"> — app chính thức truy vấn trực tiếp để hiển thị và tìm kiếm địa điểm theo loại hình, giờ mở cửa, mức giá, tọa độ.</w:t>
+      </w:r>
+    </w:p>
+    <w:p>
+      <w:pPr>
+        <w:pStyle w:val="ListNumber"/>
+      </w:pPr>
+      <w:r>
+        <w:rPr>
+          <w:b/>
+        </w:rPr>
+        <w:t>Mô-đun cảm xúc</w:t>
+      </w:r>
+      <w:r>
+        <w:t xml:space="preserve"> — dùng model đã chọn (ViSoBERT) để tự động chấm cảm xúc review người dùng và gộp thành điểm hài lòng cho từng địa điểm.</w:t>
+      </w:r>
+    </w:p>
+    <w:p>
+      <w:r>
+        <w:rPr>
+          <w:b w:val="0"/>
+        </w:rPr>
+        <w:t xml:space="preserve">Nói cách khác, đồ án đóng vai trò </w:t>
+      </w:r>
+      <w:r>
+        <w:rPr>
+          <w:b/>
+        </w:rPr>
+        <w:t>tầng dữ liệu (backend data)</w:t>
+      </w:r>
+      <w:r>
+        <w:rPr>
+          <w:b w:val="0"/>
+        </w:rPr>
+        <w:t xml:space="preserve"> của app: chuẩn bị dữ liệu địa điểm đã kiểm chứng chất lượng và mô hình phân tích cảm xúc, để phần giao diện app chính thức chỉ việc đọc và hiển thị.</w:t>
+      </w:r>
+    </w:p>
+    <w:p>
+      <w:pPr>
         <w:pStyle w:val="Heading1"/>
         <w:rPr>
-          <w:rFonts w:ascii="Times New Roman" w:hAnsi="Times New Roman" w:cs="Times New Roman"/>
-          <w:color w:val="auto"/>
+          <w:rFonts w:cs="Times New Roman"/>
         </w:rPr>
       </w:pPr>
       <w:r>
@@ -1400,8 +1725,7 @@
       <w:pPr>
         <w:pStyle w:val="Heading2"/>
         <w:rPr>
-          <w:rFonts w:ascii="Times New Roman" w:hAnsi="Times New Roman" w:cs="Times New Roman"/>
-          <w:color w:val="auto"/>
+          <w:rFonts w:cs="Times New Roman"/>
         </w:rPr>
       </w:pPr>
       <w:r>
@@ -1433,7 +1757,6 @@
           <w:rFonts w:cs="Times New Roman"/>
           <w:noProof/>
         </w:rPr>
-        <w:lastRenderedPageBreak/>
         <w:drawing>
           <wp:inline distT="0" distB="0" distL="0" distR="0" wp14:anchorId="2E0BBD0A" wp14:editId="135FE75A">
             <wp:extent cx="4680000" cy="2549130"/>
@@ -1491,8 +1814,7 @@
       <w:pPr>
         <w:pStyle w:val="Heading2"/>
         <w:rPr>
-          <w:rFonts w:ascii="Times New Roman" w:hAnsi="Times New Roman" w:cs="Times New Roman"/>
-          <w:color w:val="auto"/>
+          <w:rFonts w:cs="Times New Roman"/>
         </w:rPr>
       </w:pPr>
       <w:r>
@@ -1524,6 +1846,7 @@
           <w:rFonts w:cs="Times New Roman"/>
           <w:noProof/>
         </w:rPr>
+        <w:lastRenderedPageBreak/>
         <w:drawing>
           <wp:inline distT="0" distB="0" distL="0" distR="0" wp14:anchorId="613B1C71" wp14:editId="33BF1675">
             <wp:extent cx="3960000" cy="2710106"/>
@@ -1581,8 +1904,7 @@
       <w:pPr>
         <w:pStyle w:val="Heading2"/>
         <w:rPr>
-          <w:rFonts w:ascii="Times New Roman" w:hAnsi="Times New Roman" w:cs="Times New Roman"/>
-          <w:color w:val="auto"/>
+          <w:rFonts w:cs="Times New Roman"/>
         </w:rPr>
       </w:pPr>
       <w:r>
@@ -1614,7 +1936,6 @@
           <w:rFonts w:cs="Times New Roman"/>
           <w:noProof/>
         </w:rPr>
-        <w:lastRenderedPageBreak/>
         <w:drawing>
           <wp:inline distT="0" distB="0" distL="0" distR="0" wp14:anchorId="44CD6690" wp14:editId="16E476E9">
             <wp:extent cx="3960000" cy="2603440"/>
@@ -1686,11 +2007,11 @@
       <w:pPr>
         <w:pStyle w:val="Heading1"/>
         <w:rPr>
-          <w:rFonts w:ascii="Times New Roman" w:hAnsi="Times New Roman" w:cs="Times New Roman"/>
-          <w:color w:val="auto"/>
+          <w:rFonts w:cs="Times New Roman"/>
         </w:rPr>
       </w:pPr>
       <w:r>
+        <w:lastRenderedPageBreak/>
         <w:t>4. Nhánh 2 — Dữ liệu cảm xúc</w:t>
       </w:r>
     </w:p>
@@ -1698,8 +2019,7 @@
       <w:pPr>
         <w:pStyle w:val="Heading2"/>
         <w:rPr>
-          <w:rFonts w:ascii="Times New Roman" w:hAnsi="Times New Roman" w:cs="Times New Roman"/>
-          <w:color w:val="auto"/>
+          <w:rFonts w:cs="Times New Roman"/>
         </w:rPr>
       </w:pPr>
       <w:r>
@@ -1781,7 +2101,6 @@
           <w:i/>
           <w:sz w:val="18"/>
         </w:rPr>
-        <w:lastRenderedPageBreak/>
         <w:t>Phân bố 493 nhãn chốt — lệch mạnh về POS</w:t>
       </w:r>
     </w:p>
@@ -1803,8 +2122,7 @@
       <w:pPr>
         <w:pStyle w:val="Heading2"/>
         <w:rPr>
-          <w:rFonts w:ascii="Times New Roman" w:hAnsi="Times New Roman" w:cs="Times New Roman"/>
-          <w:color w:val="auto"/>
+          <w:rFonts w:cs="Times New Roman"/>
         </w:rPr>
       </w:pPr>
       <w:r>
@@ -1835,8 +2153,7 @@
       <w:pPr>
         <w:pStyle w:val="Heading2"/>
         <w:rPr>
-          <w:rFonts w:ascii="Times New Roman" w:hAnsi="Times New Roman" w:cs="Times New Roman"/>
-          <w:color w:val="auto"/>
+          <w:rFonts w:cs="Times New Roman"/>
         </w:rPr>
       </w:pPr>
       <w:r>
@@ -1868,6 +2185,7 @@
           <w:rFonts w:cs="Times New Roman"/>
           <w:noProof/>
         </w:rPr>
+        <w:lastRenderedPageBreak/>
         <w:drawing>
           <wp:inline distT="0" distB="0" distL="0" distR="0" wp14:anchorId="0AE9322C" wp14:editId="2F3677B6">
             <wp:extent cx="4680000" cy="2829353"/>
@@ -2147,8 +2465,7 @@
       <w:pPr>
         <w:pStyle w:val="Heading2"/>
         <w:rPr>
-          <w:rFonts w:ascii="Times New Roman" w:hAnsi="Times New Roman" w:cs="Times New Roman"/>
-          <w:color w:val="auto"/>
+          <w:rFonts w:cs="Times New Roman"/>
         </w:rPr>
       </w:pPr>
       <w:r>
@@ -2297,6 +2614,7 @@
           <w:rFonts w:cs="Times New Roman"/>
           <w:i/>
         </w:rPr>
+        <w:lastRenderedPageBreak/>
         <w:t xml:space="preserve">Nhận xét: cả hai đọc tốt POS và NEG nhưng yếu ở NEU (ViSoBERT F1≈0.40, PhoBERT≈0.26) — đúng như dự đoán từ dữ liệu lệch ở mục 4.1. </w:t>
       </w:r>
     </w:p>
@@ -2304,8 +2622,7 @@
       <w:pPr>
         <w:pStyle w:val="Heading1"/>
         <w:rPr>
-          <w:rFonts w:ascii="Times New Roman" w:hAnsi="Times New Roman" w:cs="Times New Roman"/>
-          <w:color w:val="auto"/>
+          <w:rFonts w:cs="Times New Roman"/>
         </w:rPr>
       </w:pPr>
       <w:r>
@@ -3173,7 +3490,7 @@
     <w:link w:val="Heading1Char"/>
     <w:uiPriority w:val="9"/>
     <w:qFormat/>
-    <w:rsid w:val="00FC693F"/>
+    <w:rsid w:val="00270E42"/>
     <w:pPr>
       <w:keepNext/>
       <w:keepLines/>
@@ -3181,10 +3498,9 @@
       <w:outlineLvl w:val="0"/>
     </w:pPr>
     <w:rPr>
-      <w:rFonts w:asciiTheme="majorHAnsi" w:eastAsiaTheme="majorEastAsia" w:hAnsiTheme="majorHAnsi" w:cstheme="majorBidi"/>
+      <w:rFonts w:eastAsiaTheme="majorEastAsia" w:cstheme="majorBidi"/>
       <w:b/>
       <w:bCs/>
-      <w:color w:val="365F91" w:themeColor="accent1" w:themeShade="BF"/>
       <w:sz w:val="28"/>
       <w:szCs w:val="28"/>
     </w:rPr>
@@ -3197,7 +3513,7 @@
     <w:uiPriority w:val="9"/>
     <w:unhideWhenUsed/>
     <w:qFormat/>
-    <w:rsid w:val="00FC693F"/>
+    <w:rsid w:val="00270E42"/>
     <w:pPr>
       <w:keepNext/>
       <w:keepLines/>
@@ -3205,10 +3521,9 @@
       <w:outlineLvl w:val="1"/>
     </w:pPr>
     <w:rPr>
-      <w:rFonts w:asciiTheme="majorHAnsi" w:eastAsiaTheme="majorEastAsia" w:hAnsiTheme="majorHAnsi" w:cstheme="majorBidi"/>
+      <w:rFonts w:eastAsiaTheme="majorEastAsia" w:cstheme="majorBidi"/>
       <w:b/>
       <w:bCs/>
-      <w:color w:val="4F81BD" w:themeColor="accent1"/>
       <w:szCs w:val="26"/>
     </w:rPr>
   </w:style>
@@ -3459,12 +3774,11 @@
     <w:basedOn w:val="DefaultParagraphFont"/>
     <w:link w:val="Heading1"/>
     <w:uiPriority w:val="9"/>
-    <w:rsid w:val="00FC693F"/>
+    <w:rsid w:val="00270E42"/>
     <w:rPr>
-      <w:rFonts w:asciiTheme="majorHAnsi" w:eastAsiaTheme="majorEastAsia" w:hAnsiTheme="majorHAnsi" w:cstheme="majorBidi"/>
+      <w:rFonts w:ascii="Times New Roman" w:eastAsiaTheme="majorEastAsia" w:hAnsi="Times New Roman" w:cstheme="majorBidi"/>
       <w:b/>
       <w:bCs/>
-      <w:color w:val="365F91" w:themeColor="accent1" w:themeShade="BF"/>
       <w:sz w:val="28"/>
       <w:szCs w:val="28"/>
     </w:rPr>
@@ -3474,12 +3788,11 @@
     <w:basedOn w:val="DefaultParagraphFont"/>
     <w:link w:val="Heading2"/>
     <w:uiPriority w:val="9"/>
-    <w:rsid w:val="00FC693F"/>
+    <w:rsid w:val="00270E42"/>
     <w:rPr>
-      <w:rFonts w:asciiTheme="majorHAnsi" w:eastAsiaTheme="majorEastAsia" w:hAnsiTheme="majorHAnsi" w:cstheme="majorBidi"/>
+      <w:rFonts w:ascii="Times New Roman" w:eastAsiaTheme="majorEastAsia" w:hAnsi="Times New Roman" w:cstheme="majorBidi"/>
       <w:b/>
       <w:bCs/>
-      <w:color w:val="4F81BD" w:themeColor="accent1"/>
       <w:sz w:val="26"/>
       <w:szCs w:val="26"/>
     </w:rPr>

</xml_diff>